<commit_message>
Remove placeholder analytics, fix CV link, align CV to LinkedIn dates
Co-Authored-By: Claude Sonnet 5.5 <noreply@anthropic.com>
Claude-Session: https://claude.ai/code/session_018hPFRrmsFByVHVUsEQM7eh
</commit_message>
<xml_diff>
--- a/cv/Rusumba_Bukanga_2026_CV.docx
+++ b/cv/Rusumba_Bukanga_2026_CV.docx
@@ -495,7 +495,7 @@
           <w:sz w:val="22"/>
           <w:szCs w:val="22"/>
         </w:rPr>
-        <w:t xml:space="preserve">  —  Cleverly AI</w:t>
+        <w:t xml:space="preserve">  |  Cleverly AI</w:t>
       </w:r>
     </w:p>
     <w:p>
@@ -699,7 +699,7 @@
           <w:sz w:val="22"/>
           <w:szCs w:val="22"/>
         </w:rPr>
-        <w:t xml:space="preserve">  —  Alpha Group</w:t>
+        <w:t xml:space="preserve">  |  Alpha Group</w:t>
       </w:r>
     </w:p>
     <w:p>
@@ -748,7 +748,7 @@
           <w:sz w:val="21"/>
           <w:szCs w:val="21"/>
         </w:rPr>
-        <w:t xml:space="preserve">Designed and built a centralized SSO authentication gateway serving every application across the organization's platform ecosystem — underwriting, client-facing, and internal HR systems — built on AWS Lambda, API Gateway, Cognito, DynamoDB, and KMS-signed JWTs</w:t>
+        <w:t>Designed and built a centralized SSO authentication gateway serving every application across the organization's platform ecosystem | underwriting, client-facing, and internal HR systems | built on AWS Lambda, API Gateway, Cognito, DynamoDB, and KMS-signed JWTs</w:t>
       </w:r>
     </w:p>
     <w:p>
@@ -1038,7 +1038,7 @@
           <w:sz w:val="22"/>
           <w:szCs w:val="22"/>
         </w:rPr>
-        <w:t xml:space="preserve">  —  123Tutors (Pty) Ltd</w:t>
+        <w:t xml:space="preserve">  |  123Tutors (Pty) Ltd</w:t>
       </w:r>
     </w:p>
     <w:p>
@@ -1054,7 +1054,7 @@
           <w:sz w:val="20"/>
           <w:szCs w:val="20"/>
         </w:rPr>
-        <w:t xml:space="preserve">South Africa  |  2026 – Present  (returned in a leadership capacity after 2023–2024 engineering tenure)</w:t>
+        <w:t>South Africa  |  Aug 2025 – Present</w:t>
       </w:r>
     </w:p>
     <w:p>
@@ -1144,7 +1144,7 @@
           <w:sz w:val="21"/>
           <w:szCs w:val="21"/>
         </w:rPr>
-        <w:t xml:space="preserve">Shipped an AI Tutor feature powered by Claude (via AWS Bedrock) — real-time streaming chat with intent classification, worked examples, and generated interactive mindmaps/diagrams for student learning support</w:t>
+        <w:t>Shipped an AI Tutor feature powered by Claude (via AWS Bedrock) | real-time streaming chat with intent classification, worked examples, and generated interactive mindmaps/diagrams for student learning support</w:t>
       </w:r>
     </w:p>
     <w:p>
@@ -1188,7 +1188,7 @@
           <w:sz w:val="22"/>
           <w:szCs w:val="22"/>
         </w:rPr>
-        <w:t xml:space="preserve">  —  Reflex Solutions (Pty) Ltd</w:t>
+        <w:t xml:space="preserve">  |  Reflex Solutions (Pty) Ltd</w:t>
       </w:r>
     </w:p>
     <w:p>
@@ -1204,7 +1204,7 @@
           <w:sz w:val="20"/>
           <w:szCs w:val="20"/>
         </w:rPr>
-        <w:t xml:space="preserve">Johannesburg, South Africa  |  2023 – 2024</w:t>
+        <w:t>Johannesburg, South Africa  |  Dec 2024 – Jul 2025 (Contract)</w:t>
       </w:r>
     </w:p>
     <w:p>
@@ -1331,102 +1331,6 @@
           <w:szCs w:val="21"/>
         </w:rPr>
         <w:t xml:space="preserve">Applied ITIL-aligned incident, problem, and change management practices</w:t>
-      </w:r>
-    </w:p>
-    <w:p>
-      <w:pPr>
-        <w:spacing w:after="20" w:before="180"/>
-      </w:pPr>
-      <w:r>
-        <w:rPr>
-          <w:rFonts w:ascii="Calibri" w:cs="Calibri" w:eastAsia="Calibri" w:hAnsi="Calibri"/>
-          <w:b/>
-          <w:bCs/>
-          <w:sz w:val="22"/>
-          <w:szCs w:val="22"/>
-        </w:rPr>
-        <w:t xml:space="preserve">Junior Software Engineer / Machine Learning Engineer</w:t>
-      </w:r>
-      <w:r>
-        <w:rPr>
-          <w:rFonts w:ascii="Calibri" w:cs="Calibri" w:eastAsia="Calibri" w:hAnsi="Calibri"/>
-          <w:b/>
-          <w:bCs/>
-          <w:color w:val="1F3864"/>
-          <w:sz w:val="22"/>
-          <w:szCs w:val="22"/>
-        </w:rPr>
-        <w:t xml:space="preserve">  —  123Tutors (Pty) Ltd</w:t>
-      </w:r>
-    </w:p>
-    <w:p>
-      <w:pPr>
-        <w:spacing w:after="90"/>
-      </w:pPr>
-      <w:r>
-        <w:rPr>
-          <w:rFonts w:ascii="Calibri" w:cs="Calibri" w:eastAsia="Calibri" w:hAnsi="Calibri"/>
-          <w:i/>
-          <w:iCs/>
-          <w:color w:val="555555"/>
-          <w:sz w:val="20"/>
-          <w:szCs w:val="20"/>
-        </w:rPr>
-        <w:t xml:space="preserve">Johannesburg, South Africa  |  Apr 2023 – Sep 2024</w:t>
-      </w:r>
-    </w:p>
-    <w:p>
-      <w:pPr>
-        <w:pStyle w:val="ListParagraph"/>
-        <w:numPr>
-          <w:ilvl w:val="0"/>
-          <w:numId w:val="2"/>
-        </w:numPr>
-        <w:spacing w:after="60"/>
-      </w:pPr>
-      <w:r>
-        <w:rPr>
-          <w:rFonts w:ascii="Calibri" w:cs="Calibri" w:eastAsia="Calibri" w:hAnsi="Calibri"/>
-          <w:sz w:val="21"/>
-          <w:szCs w:val="21"/>
-        </w:rPr>
-        <w:t xml:space="preserve">Developed scalable cloud-native systems using Ruby on Rails and FastAPI</w:t>
-      </w:r>
-    </w:p>
-    <w:p>
-      <w:pPr>
-        <w:pStyle w:val="ListParagraph"/>
-        <w:numPr>
-          <w:ilvl w:val="0"/>
-          <w:numId w:val="2"/>
-        </w:numPr>
-        <w:spacing w:after="60"/>
-      </w:pPr>
-      <w:r>
-        <w:rPr>
-          <w:rFonts w:ascii="Calibri" w:cs="Calibri" w:eastAsia="Calibri" w:hAnsi="Calibri"/>
-          <w:sz w:val="21"/>
-          <w:szCs w:val="21"/>
-        </w:rPr>
-        <w:t xml:space="preserve">Built CI/CD pipelines and deployed containerized services on Google Cloud Platform</w:t>
-      </w:r>
-    </w:p>
-    <w:p>
-      <w:pPr>
-        <w:pStyle w:val="ListParagraph"/>
-        <w:numPr>
-          <w:ilvl w:val="0"/>
-          <w:numId w:val="2"/>
-        </w:numPr>
-        <w:spacing w:after="60"/>
-      </w:pPr>
-      <w:r>
-        <w:rPr>
-          <w:rFonts w:ascii="Calibri" w:cs="Calibri" w:eastAsia="Calibri" w:hAnsi="Calibri"/>
-          <w:sz w:val="21"/>
-          <w:szCs w:val="21"/>
-        </w:rPr>
-        <w:t xml:space="preserve">Implemented RESTful APIs and automated machine learning model deployment pipelines</w:t>
       </w:r>
     </w:p>
     <w:p>
@@ -1463,25 +1367,25 @@
           <w:sz w:val="21"/>
           <w:szCs w:val="21"/>
         </w:rPr>
-        <w:t xml:space="preserve">BCom, Logistics Management — University of Johannesburg</w:t>
-      </w:r>
-    </w:p>
-    <w:p>
-      <w:pPr>
-        <w:pStyle w:val="ListParagraph"/>
-        <w:numPr>
-          <w:ilvl w:val="0"/>
-          <w:numId w:val="2"/>
-        </w:numPr>
-        <w:spacing w:after="60"/>
-      </w:pPr>
-      <w:r>
-        <w:rPr>
-          <w:rFonts w:ascii="Calibri" w:cs="Calibri" w:eastAsia="Calibri" w:hAnsi="Calibri"/>
-          <w:sz w:val="21"/>
-          <w:szCs w:val="21"/>
-        </w:rPr>
-        <w:t xml:space="preserve">SLP, Quantitative Finance — University of Johannesburg</w:t>
+        <w:t>BCom, Logistics Management | University of Johannesburg</w:t>
+      </w:r>
+    </w:p>
+    <w:p>
+      <w:pPr>
+        <w:pStyle w:val="ListParagraph"/>
+        <w:numPr>
+          <w:ilvl w:val="0"/>
+          <w:numId w:val="2"/>
+        </w:numPr>
+        <w:spacing w:after="60"/>
+      </w:pPr>
+      <w:r>
+        <w:rPr>
+          <w:rFonts w:ascii="Calibri" w:cs="Calibri" w:eastAsia="Calibri" w:hAnsi="Calibri"/>
+          <w:sz w:val="21"/>
+          <w:szCs w:val="21"/>
+        </w:rPr>
+        <w:t>SLP, Quantitative Finance | University of Johannesburg</w:t>
       </w:r>
     </w:p>
     <w:p>
@@ -1518,7 +1422,7 @@
           <w:sz w:val="21"/>
           <w:szCs w:val="21"/>
         </w:rPr>
-        <w:t xml:space="preserve">Cleverly AI Grader — AI-assisted, evidence-linked grading platform for schools, colleges, and universities (</w:t>
+        <w:t>Cleverly AI Grader | AI-assisted, evidence-linked grading platform for schools, colleges, and universities (</w:t>
       </w:r>
       <w:hyperlink w:history="1" r:id="rIdwiq82oxask3ro-83efp7i">
         <w:r>
@@ -1556,115 +1460,115 @@
           <w:sz w:val="21"/>
           <w:szCs w:val="21"/>
         </w:rPr>
-        <w:t xml:space="preserve">Centralized SSO Authentication Gateway — Auth service (OAuth2/PKCE, Cognito, KMS-signed JWTs) serving an organization's full application ecosystem</w:t>
-      </w:r>
-    </w:p>
-    <w:p>
-      <w:pPr>
-        <w:pStyle w:val="ListParagraph"/>
-        <w:numPr>
-          <w:ilvl w:val="0"/>
-          <w:numId w:val="2"/>
-        </w:numPr>
-        <w:spacing w:after="60"/>
-      </w:pPr>
-      <w:r>
-        <w:rPr>
-          <w:rFonts w:ascii="Calibri" w:cs="Calibri" w:eastAsia="Calibri" w:hAnsi="Calibri"/>
-          <w:sz w:val="21"/>
-          <w:szCs w:val="21"/>
-        </w:rPr>
-        <w:t xml:space="preserve">Alpha HR Portal — Internal employee self-service platform with org-chart, events, and Microsoft Graph integration</w:t>
-      </w:r>
-    </w:p>
-    <w:p>
-      <w:pPr>
-        <w:pStyle w:val="ListParagraph"/>
-        <w:numPr>
-          <w:ilvl w:val="0"/>
-          <w:numId w:val="2"/>
-        </w:numPr>
-        <w:spacing w:after="60"/>
-      </w:pPr>
-      <w:r>
-        <w:rPr>
-          <w:rFonts w:ascii="Calibri" w:cs="Calibri" w:eastAsia="Calibri" w:hAnsi="Calibri"/>
-          <w:sz w:val="21"/>
-          <w:szCs w:val="21"/>
-        </w:rPr>
-        <w:t xml:space="preserve">Broker Onboarding Portal — Streamlined agent recruitment and compliance workflow for Alpha Insure</w:t>
-      </w:r>
-    </w:p>
-    <w:p>
-      <w:pPr>
-        <w:pStyle w:val="ListParagraph"/>
-        <w:numPr>
-          <w:ilvl w:val="0"/>
-          <w:numId w:val="2"/>
-        </w:numPr>
-        <w:spacing w:after="60"/>
-      </w:pPr>
-      <w:r>
-        <w:rPr>
-          <w:rFonts w:ascii="Calibri" w:cs="Calibri" w:eastAsia="Calibri" w:hAnsi="Calibri"/>
-          <w:sz w:val="21"/>
-          <w:szCs w:val="21"/>
-        </w:rPr>
-        <w:t xml:space="preserve">Restaurant Booking Platform — Real-time reservation system with dynamic dashboarding</w:t>
-      </w:r>
-    </w:p>
-    <w:p>
-      <w:pPr>
-        <w:pStyle w:val="ListParagraph"/>
-        <w:numPr>
-          <w:ilvl w:val="0"/>
-          <w:numId w:val="2"/>
-        </w:numPr>
-        <w:spacing w:after="60"/>
-      </w:pPr>
-      <w:r>
-        <w:rPr>
-          <w:rFonts w:ascii="Calibri" w:cs="Calibri" w:eastAsia="Calibri" w:hAnsi="Calibri"/>
-          <w:sz w:val="21"/>
-          <w:szCs w:val="21"/>
-        </w:rPr>
-        <w:t xml:space="preserve">Body Action Events Portal — Event scheduling and membership management system</w:t>
-      </w:r>
-    </w:p>
-    <w:p>
-      <w:pPr>
-        <w:pStyle w:val="ListParagraph"/>
-        <w:numPr>
-          <w:ilvl w:val="0"/>
-          <w:numId w:val="2"/>
-        </w:numPr>
-        <w:spacing w:after="60"/>
-      </w:pPr>
-      <w:r>
-        <w:rPr>
-          <w:rFonts w:ascii="Calibri" w:cs="Calibri" w:eastAsia="Calibri" w:hAnsi="Calibri"/>
-          <w:sz w:val="21"/>
-          <w:szCs w:val="21"/>
-        </w:rPr>
-        <w:t xml:space="preserve">Membership Debit Order Run — Automated recurring billing and bank reconciliation system for gym memberships, built on AWS (Lambda, EventBridge, S3, SES/SNS)</w:t>
-      </w:r>
-    </w:p>
-    <w:p>
-      <w:pPr>
-        <w:pStyle w:val="ListParagraph"/>
-        <w:numPr>
-          <w:ilvl w:val="0"/>
-          <w:numId w:val="2"/>
-        </w:numPr>
-        <w:spacing w:after="60"/>
-      </w:pPr>
-      <w:r>
-        <w:rPr>
-          <w:rFonts w:ascii="Calibri" w:cs="Calibri" w:eastAsia="Calibri" w:hAnsi="Calibri"/>
-          <w:sz w:val="21"/>
-          <w:szCs w:val="21"/>
-        </w:rPr>
-        <w:t xml:space="preserve">123tutors Platform Migration — Led migration from Bubble to Next.js/TypeScript with Prisma, Supabase, and Vercel; architected the tutor-matching engine roadmap (</w:t>
+        <w:t>Centralized SSO Authentication Gateway | Auth service (OAuth2/PKCE, Cognito, KMS-signed JWTs) serving an organization's full application ecosystem</w:t>
+      </w:r>
+    </w:p>
+    <w:p>
+      <w:pPr>
+        <w:pStyle w:val="ListParagraph"/>
+        <w:numPr>
+          <w:ilvl w:val="0"/>
+          <w:numId w:val="2"/>
+        </w:numPr>
+        <w:spacing w:after="60"/>
+      </w:pPr>
+      <w:r>
+        <w:rPr>
+          <w:rFonts w:ascii="Calibri" w:cs="Calibri" w:eastAsia="Calibri" w:hAnsi="Calibri"/>
+          <w:sz w:val="21"/>
+          <w:szCs w:val="21"/>
+        </w:rPr>
+        <w:t>Alpha HR Portal | Internal employee self-service platform with org-chart, events, and Microsoft Graph integration</w:t>
+      </w:r>
+    </w:p>
+    <w:p>
+      <w:pPr>
+        <w:pStyle w:val="ListParagraph"/>
+        <w:numPr>
+          <w:ilvl w:val="0"/>
+          <w:numId w:val="2"/>
+        </w:numPr>
+        <w:spacing w:after="60"/>
+      </w:pPr>
+      <w:r>
+        <w:rPr>
+          <w:rFonts w:ascii="Calibri" w:cs="Calibri" w:eastAsia="Calibri" w:hAnsi="Calibri"/>
+          <w:sz w:val="21"/>
+          <w:szCs w:val="21"/>
+        </w:rPr>
+        <w:t>Broker Onboarding Portal | Streamlined agent recruitment and compliance workflow for Alpha Insure</w:t>
+      </w:r>
+    </w:p>
+    <w:p>
+      <w:pPr>
+        <w:pStyle w:val="ListParagraph"/>
+        <w:numPr>
+          <w:ilvl w:val="0"/>
+          <w:numId w:val="2"/>
+        </w:numPr>
+        <w:spacing w:after="60"/>
+      </w:pPr>
+      <w:r>
+        <w:rPr>
+          <w:rFonts w:ascii="Calibri" w:cs="Calibri" w:eastAsia="Calibri" w:hAnsi="Calibri"/>
+          <w:sz w:val="21"/>
+          <w:szCs w:val="21"/>
+        </w:rPr>
+        <w:t>Restaurant Booking Platform | Real-time reservation system with dynamic dashboarding</w:t>
+      </w:r>
+    </w:p>
+    <w:p>
+      <w:pPr>
+        <w:pStyle w:val="ListParagraph"/>
+        <w:numPr>
+          <w:ilvl w:val="0"/>
+          <w:numId w:val="2"/>
+        </w:numPr>
+        <w:spacing w:after="60"/>
+      </w:pPr>
+      <w:r>
+        <w:rPr>
+          <w:rFonts w:ascii="Calibri" w:cs="Calibri" w:eastAsia="Calibri" w:hAnsi="Calibri"/>
+          <w:sz w:val="21"/>
+          <w:szCs w:val="21"/>
+        </w:rPr>
+        <w:t>Body Action Events Portal | Event scheduling and membership management system</w:t>
+      </w:r>
+    </w:p>
+    <w:p>
+      <w:pPr>
+        <w:pStyle w:val="ListParagraph"/>
+        <w:numPr>
+          <w:ilvl w:val="0"/>
+          <w:numId w:val="2"/>
+        </w:numPr>
+        <w:spacing w:after="60"/>
+      </w:pPr>
+      <w:r>
+        <w:rPr>
+          <w:rFonts w:ascii="Calibri" w:cs="Calibri" w:eastAsia="Calibri" w:hAnsi="Calibri"/>
+          <w:sz w:val="21"/>
+          <w:szCs w:val="21"/>
+        </w:rPr>
+        <w:t>Membership Debit Order Run | Automated recurring billing and bank reconciliation system for gym memberships, built on AWS (Lambda, EventBridge, S3, SES/SNS)</w:t>
+      </w:r>
+    </w:p>
+    <w:p>
+      <w:pPr>
+        <w:pStyle w:val="ListParagraph"/>
+        <w:numPr>
+          <w:ilvl w:val="0"/>
+          <w:numId w:val="2"/>
+        </w:numPr>
+        <w:spacing w:after="60"/>
+      </w:pPr>
+      <w:r>
+        <w:rPr>
+          <w:rFonts w:ascii="Calibri" w:cs="Calibri" w:eastAsia="Calibri" w:hAnsi="Calibri"/>
+          <w:sz w:val="21"/>
+          <w:szCs w:val="21"/>
+        </w:rPr>
+        <w:t>123tutors Platform Migration | Led migration from Bubble to Next.js/TypeScript with Prisma, Supabase, and Vercel; architected the tutor-matching engine roadmap (</w:t>
       </w:r>
       <w:hyperlink w:history="1" r:id="rIddtghmcfztz_7fpgtix9-r">
         <w:r>
@@ -1702,79 +1606,79 @@
           <w:sz w:val="21"/>
           <w:szCs w:val="21"/>
         </w:rPr>
-        <w:t xml:space="preserve">AI Tutor (123tutors) — Claude-powered (via AWS Bedrock) streaming chat tutor with intent classification, worked examples, and generated interactive mindmaps/diagrams</w:t>
-      </w:r>
-    </w:p>
-    <w:p>
-      <w:pPr>
-        <w:pStyle w:val="ListParagraph"/>
-        <w:numPr>
-          <w:ilvl w:val="0"/>
-          <w:numId w:val="2"/>
-        </w:numPr>
-        <w:spacing w:after="60"/>
-      </w:pPr>
-      <w:r>
-        <w:rPr>
-          <w:rFonts w:ascii="Calibri" w:cs="Calibri" w:eastAsia="Calibri" w:hAnsi="Calibri"/>
-          <w:sz w:val="21"/>
-          <w:szCs w:val="21"/>
-        </w:rPr>
-        <w:t xml:space="preserve">Cloud-Native Recommendation Engine — Deployed FastAPI and BigQuery-based system on GCP</w:t>
-      </w:r>
-    </w:p>
-    <w:p>
-      <w:pPr>
-        <w:pStyle w:val="ListParagraph"/>
-        <w:numPr>
-          <w:ilvl w:val="0"/>
-          <w:numId w:val="2"/>
-        </w:numPr>
-        <w:spacing w:after="60"/>
-      </w:pPr>
-      <w:r>
-        <w:rPr>
-          <w:rFonts w:ascii="Calibri" w:cs="Calibri" w:eastAsia="Calibri" w:hAnsi="Calibri"/>
-          <w:sz w:val="21"/>
-          <w:szCs w:val="21"/>
-        </w:rPr>
-        <w:t xml:space="preserve">Network Automation Suite — Created Python automation tools for enterprise diagnostics</w:t>
-      </w:r>
-    </w:p>
-    <w:p>
-      <w:pPr>
-        <w:pStyle w:val="ListParagraph"/>
-        <w:numPr>
-          <w:ilvl w:val="0"/>
-          <w:numId w:val="2"/>
-        </w:numPr>
-        <w:spacing w:after="60"/>
-      </w:pPr>
-      <w:r>
-        <w:rPr>
-          <w:rFonts w:ascii="Calibri" w:cs="Calibri" w:eastAsia="Calibri" w:hAnsi="Calibri"/>
-          <w:sz w:val="21"/>
-          <w:szCs w:val="21"/>
-        </w:rPr>
-        <w:t xml:space="preserve">Security Reviews — Conducted internal security and dependency audits on production web platforms, implementing secrets management and secure-coding standards</w:t>
-      </w:r>
-    </w:p>
-    <w:p>
-      <w:pPr>
-        <w:pStyle w:val="ListParagraph"/>
-        <w:numPr>
-          <w:ilvl w:val="0"/>
-          <w:numId w:val="2"/>
-        </w:numPr>
-        <w:spacing w:after="60"/>
-      </w:pPr>
-      <w:r>
-        <w:rPr>
-          <w:rFonts w:ascii="Calibri" w:cs="Calibri" w:eastAsia="Calibri" w:hAnsi="Calibri"/>
-          <w:sz w:val="21"/>
-          <w:szCs w:val="21"/>
-        </w:rPr>
-        <w:t xml:space="preserve">Personal Cybersecurity Lab — Built a segmented, VPN-gated home lab for offensive security practice using Kali Linux (Nmap, Metasploit, Burp Suite) against intentionally vulnerable applications (OWASP Juice Shop, DVWA)</w:t>
+        <w:t>AI Tutor (123tutors) | Claude-powered (via AWS Bedrock) streaming chat tutor with intent classification, worked examples, and generated interactive mindmaps/diagrams</w:t>
+      </w:r>
+    </w:p>
+    <w:p>
+      <w:pPr>
+        <w:pStyle w:val="ListParagraph"/>
+        <w:numPr>
+          <w:ilvl w:val="0"/>
+          <w:numId w:val="2"/>
+        </w:numPr>
+        <w:spacing w:after="60"/>
+      </w:pPr>
+      <w:r>
+        <w:rPr>
+          <w:rFonts w:ascii="Calibri" w:cs="Calibri" w:eastAsia="Calibri" w:hAnsi="Calibri"/>
+          <w:sz w:val="21"/>
+          <w:szCs w:val="21"/>
+        </w:rPr>
+        <w:t>Cloud-Native Recommendation Engine | Deployed FastAPI and BigQuery-based system on GCP</w:t>
+      </w:r>
+    </w:p>
+    <w:p>
+      <w:pPr>
+        <w:pStyle w:val="ListParagraph"/>
+        <w:numPr>
+          <w:ilvl w:val="0"/>
+          <w:numId w:val="2"/>
+        </w:numPr>
+        <w:spacing w:after="60"/>
+      </w:pPr>
+      <w:r>
+        <w:rPr>
+          <w:rFonts w:ascii="Calibri" w:cs="Calibri" w:eastAsia="Calibri" w:hAnsi="Calibri"/>
+          <w:sz w:val="21"/>
+          <w:szCs w:val="21"/>
+        </w:rPr>
+        <w:t>Network Automation Suite | Created Python automation tools for enterprise diagnostics</w:t>
+      </w:r>
+    </w:p>
+    <w:p>
+      <w:pPr>
+        <w:pStyle w:val="ListParagraph"/>
+        <w:numPr>
+          <w:ilvl w:val="0"/>
+          <w:numId w:val="2"/>
+        </w:numPr>
+        <w:spacing w:after="60"/>
+      </w:pPr>
+      <w:r>
+        <w:rPr>
+          <w:rFonts w:ascii="Calibri" w:cs="Calibri" w:eastAsia="Calibri" w:hAnsi="Calibri"/>
+          <w:sz w:val="21"/>
+          <w:szCs w:val="21"/>
+        </w:rPr>
+        <w:t>Security Reviews | Conducted internal security and dependency audits on production web platforms, implementing secrets management and secure-coding standards</w:t>
+      </w:r>
+    </w:p>
+    <w:p>
+      <w:pPr>
+        <w:pStyle w:val="ListParagraph"/>
+        <w:numPr>
+          <w:ilvl w:val="0"/>
+          <w:numId w:val="2"/>
+        </w:numPr>
+        <w:spacing w:after="60"/>
+      </w:pPr>
+      <w:r>
+        <w:rPr>
+          <w:rFonts w:ascii="Calibri" w:cs="Calibri" w:eastAsia="Calibri" w:hAnsi="Calibri"/>
+          <w:sz w:val="21"/>
+          <w:szCs w:val="21"/>
+        </w:rPr>
+        <w:t>Personal Cybersecurity Lab | Built a segmented, VPN-gated home lab for offensive security practice using Kali Linux (Nmap, Metasploit, Burp Suite) against intentionally vulnerable applications (OWASP Juice Shop, DVWA)</w:t>
       </w:r>
     </w:p>
     <w:p>

</xml_diff>